<commit_message>
feat: implement workload sizing heuristics and enhance screenshot automation for high-resolution documentation generation
</commit_message>
<xml_diff>
--- a/docs/Chapter_4_System_Implementation_Testing.docx
+++ b/docs/Chapter_4_System_Implementation_Testing.docx
@@ -59,7 +59,7 @@
           <w:color w:val="0F172A"/>
           <w:sz w:val="23"/>
         </w:rPr>
-        <w:t>. Following the Design Science methodology and dual-objective mathematical formulation established in Chapter Three, this implementation translates multi-objective greedy scoring algorithms, Min-Max normalization, and relational SQLite schema definitions into a production-grade interactive cloud storage optimization platform.</w:t>
+        <w:t>. Following the Design Science methodology and dual-objective mathematical formulation established in Chapter Three, this implementation translates multi-objective greedy scoring algorithms, Min-Max normalization, automated workload storage estimation models, and relational SQLite schema definitions into a production-grade interactive cloud storage optimization platform.</w:t>
       </w:r>
     </w:p>
     <w:p>
@@ -72,7 +72,24 @@
           <w:color w:val="0F172A"/>
           <w:sz w:val="23"/>
         </w:rPr>
-        <w:t>The system provides a real-time web-based simulation environment that enables cloud infrastructure administrators to optimize cloud storage tier allocation (Block, File, Object) against strict Service Level Agreement (SLA) availability constraints and max access latency thresholds while minimizing total operational expenditures.</w:t>
+        <w:t xml:space="preserve">The system provides a real-time web-based simulation environment that enables cloud infrastructure administrators to optimize cloud storage tier allocation (Block, File, Object) against strict Service Level Agreement (SLA) availability constraints and max access latency thresholds while minimizing total operational expenditures. Furthermore, the platform features an </w:t>
+      </w:r>
+      <w:r>
+        <w:rPr>
+          <w:rFonts w:ascii="Times New Roman" w:hAnsi="Times New Roman"/>
+          <w:b/>
+          <w:color w:val="0F172A"/>
+          <w:sz w:val="23"/>
+        </w:rPr>
+        <w:t>Automatic Storage Size Suggestion Engine</w:t>
+      </w:r>
+      <w:r>
+        <w:rPr>
+          <w:rFonts w:ascii="Times New Roman" w:hAnsi="Times New Roman"/>
+          <w:color w:val="0F172A"/>
+          <w:sz w:val="23"/>
+        </w:rPr>
+        <w:t xml:space="preserve"> that calculates required storage capacity based on enterprise workload profiles.</w:t>
       </w:r>
     </w:p>
     <w:p>
@@ -906,13 +923,13 @@
               <w:br/>
               <w:t>├── database.py              # SQLite Data Access Layer &amp; Relational Schema</w:t>
               <w:br/>
-              <w:t>├── heuristic.py             # Heuristic Algorithm &amp; Baseline Engine</w:t>
+              <w:t>├── heuristic.py             # Heuristic Algorithm, Baseline Engine &amp; Workload Estimator</w:t>
               <w:br/>
               <w:t>├── mock_data.py             # Workload Benchmark Generator Utility</w:t>
               <w:br/>
               <w:t>└── modules/</w:t>
               <w:br/>
-              <w:t xml:space="preserve">    ├── allocation.py        # Interactive Storage Allocation &amp; Baseline View</w:t>
+              <w:t xml:space="preserve">    ├── allocation.py        # Interactive Storage Allocation &amp; Auto-Suggest View</w:t>
               <w:br/>
               <w:t xml:space="preserve">    ├── dashboard.py         # Executive System KPI &amp; Analytics View</w:t>
               <w:br/>
@@ -969,7 +986,7 @@
           <w:color w:val="334155"/>
           <w:sz w:val="25"/>
         </w:rPr>
-        <w:t>4.2.2 Dual-Objective Heuristic Scoring Engine (`heuristic.py`)</w:t>
+        <w:t>4.2.2 Dual-Objective Heuristic Engine &amp; Auto-Suggest Module (`heuristic.py`)</w:t>
       </w:r>
     </w:p>
     <w:p>
@@ -982,7 +999,217 @@
           <w:color w:val="0F172A"/>
           <w:sz w:val="23"/>
         </w:rPr>
-        <w:t>`heuristic.py` implements the core algorithm developed in Chapter Three. It evaluates candidate cloud storage tiers against hard constraints (minimum SLA availability % and maximum access latency ms). For eligible candidate tiers, it computes total estimated cost ($C$) and unavailability ($U = 1.0 - \text{SLA}/100$). It normalizes $C$ and $U$ using Min-Max scaling across candidate tier bounds, evaluates the weighted objective score ($\text{Score} = \alpha \cdot C_{\text{norm}} + \beta \cdot U_{\text{norm}}$), and selects the tier that minimizes this score. Additionally, `heuristic.py` implements First Fit (FF), Best Fit (BF), and Worst Fit (WF) baseline allocation routines for comparative performance benchmarking.</w:t>
+        <w:t>`heuristic.py` implements both the workload estimation model and the core allocation algorithm developed in Chapter Three:</w:t>
+      </w:r>
+    </w:p>
+    <w:p>
+      <w:pPr>
+        <w:spacing w:before="0" w:after="120" w:line="276" w:lineRule="auto"/>
+      </w:pPr>
+      <w:r>
+        <w:rPr>
+          <w:rFonts w:ascii="Times New Roman" w:hAnsi="Times New Roman"/>
+          <w:color w:val="0F172A"/>
+          <w:sz w:val="23"/>
+        </w:rPr>
+        <w:t xml:space="preserve">1. </w:t>
+      </w:r>
+      <w:r>
+        <w:rPr>
+          <w:rFonts w:ascii="Times New Roman" w:hAnsi="Times New Roman"/>
+          <w:b/>
+          <w:color w:val="0F172A"/>
+          <w:sz w:val="23"/>
+        </w:rPr>
+        <w:t>Automated Storage Sizing Engine (`suggest_workload_size`)</w:t>
+      </w:r>
+      <w:r>
+        <w:rPr>
+          <w:rFonts w:ascii="Times New Roman" w:hAnsi="Times New Roman"/>
+          <w:color w:val="0F172A"/>
+          <w:sz w:val="23"/>
+        </w:rPr>
+        <w:t>: Calculates recommended storage size ($S_{\text{req}}$ in GB) based on operational parameters across five enterprise workload profiles:</w:t>
+      </w:r>
+    </w:p>
+    <w:p>
+      <w:pPr>
+        <w:spacing w:before="0" w:after="120" w:line="276" w:lineRule="auto"/>
+      </w:pPr>
+      <w:r>
+        <w:rPr>
+          <w:rFonts w:ascii="Times New Roman" w:hAnsi="Times New Roman"/>
+          <w:color w:val="0F172A"/>
+          <w:sz w:val="23"/>
+        </w:rPr>
+        <w:t xml:space="preserve">   - </w:t>
+      </w:r>
+      <w:r>
+        <w:rPr>
+          <w:rFonts w:ascii="Times New Roman" w:hAnsi="Times New Roman"/>
+          <w:b/>
+          <w:color w:val="0F172A"/>
+          <w:sz w:val="23"/>
+        </w:rPr>
+        <w:t>Enterprise Relational DB (OLTP)</w:t>
+      </w:r>
+      <w:r>
+        <w:rPr>
+          <w:rFonts w:ascii="Times New Roman" w:hAnsi="Times New Roman"/>
+          <w:color w:val="0F172A"/>
+          <w:sz w:val="23"/>
+        </w:rPr>
+        <w:t>: $S_{\text{req}} = 20.0 + (U \times 0.05) + (T \times 0.0001)$</w:t>
+      </w:r>
+    </w:p>
+    <w:p>
+      <w:pPr>
+        <w:spacing w:before="0" w:after="120" w:line="276" w:lineRule="auto"/>
+      </w:pPr>
+      <w:r>
+        <w:rPr>
+          <w:rFonts w:ascii="Times New Roman" w:hAnsi="Times New Roman"/>
+          <w:color w:val="0F172A"/>
+          <w:sz w:val="23"/>
+        </w:rPr>
+        <w:t xml:space="preserve">   - </w:t>
+      </w:r>
+      <w:r>
+        <w:rPr>
+          <w:rFonts w:ascii="Times New Roman" w:hAnsi="Times New Roman"/>
+          <w:b/>
+          <w:color w:val="0F172A"/>
+          <w:sz w:val="23"/>
+        </w:rPr>
+        <w:t>HD Video Streaming</w:t>
+      </w:r>
+      <w:r>
+        <w:rPr>
+          <w:rFonts w:ascii="Times New Roman" w:hAnsi="Times New Roman"/>
+          <w:color w:val="0F172A"/>
+          <w:sz w:val="23"/>
+        </w:rPr>
+        <w:t>: $S_{\text{req}} = A \times \text{Size\_Per\_Asset}$</w:t>
+      </w:r>
+    </w:p>
+    <w:p>
+      <w:pPr>
+        <w:spacing w:before="0" w:after="120" w:line="276" w:lineRule="auto"/>
+      </w:pPr>
+      <w:r>
+        <w:rPr>
+          <w:rFonts w:ascii="Times New Roman" w:hAnsi="Times New Roman"/>
+          <w:color w:val="0F172A"/>
+          <w:sz w:val="23"/>
+        </w:rPr>
+        <w:t xml:space="preserve">   - </w:t>
+      </w:r>
+      <w:r>
+        <w:rPr>
+          <w:rFonts w:ascii="Times New Roman" w:hAnsi="Times New Roman"/>
+          <w:b/>
+          <w:color w:val="0F172A"/>
+          <w:sz w:val="23"/>
+        </w:rPr>
+        <w:t>IoT Sensor &amp; Log Analytics</w:t>
+      </w:r>
+      <w:r>
+        <w:rPr>
+          <w:rFonts w:ascii="Times New Roman" w:hAnsi="Times New Roman"/>
+          <w:color w:val="0F172A"/>
+          <w:sz w:val="23"/>
+        </w:rPr>
+        <w:t>: $S_{\text{req}} = (D \times L \times P) / 1024$</w:t>
+      </w:r>
+    </w:p>
+    <w:p>
+      <w:pPr>
+        <w:spacing w:before="0" w:after="120" w:line="276" w:lineRule="auto"/>
+      </w:pPr>
+      <w:r>
+        <w:rPr>
+          <w:rFonts w:ascii="Times New Roman" w:hAnsi="Times New Roman"/>
+          <w:color w:val="0F172A"/>
+          <w:sz w:val="23"/>
+        </w:rPr>
+        <w:t xml:space="preserve">   - </w:t>
+      </w:r>
+      <w:r>
+        <w:rPr>
+          <w:rFonts w:ascii="Times New Roman" w:hAnsi="Times New Roman"/>
+          <w:b/>
+          <w:color w:val="0F172A"/>
+          <w:sz w:val="23"/>
+        </w:rPr>
+        <w:t>Document CMS</w:t>
+      </w:r>
+      <w:r>
+        <w:rPr>
+          <w:rFonts w:ascii="Times New Roman" w:hAnsi="Times New Roman"/>
+          <w:color w:val="0F172A"/>
+          <w:sz w:val="23"/>
+        </w:rPr>
+        <w:t>: $S_{\text{req}} = (E \times \text{Docs\_Per\_Emp} \times \text{Doc\_Size\_MB}) / 1024$</w:t>
+      </w:r>
+    </w:p>
+    <w:p>
+      <w:pPr>
+        <w:spacing w:before="0" w:after="120" w:line="276" w:lineRule="auto"/>
+      </w:pPr>
+      <w:r>
+        <w:rPr>
+          <w:rFonts w:ascii="Times New Roman" w:hAnsi="Times New Roman"/>
+          <w:color w:val="0F172A"/>
+          <w:sz w:val="23"/>
+        </w:rPr>
+        <w:t xml:space="preserve">   - </w:t>
+      </w:r>
+      <w:r>
+        <w:rPr>
+          <w:rFonts w:ascii="Times New Roman" w:hAnsi="Times New Roman"/>
+          <w:b/>
+          <w:color w:val="0F172A"/>
+          <w:sz w:val="23"/>
+        </w:rPr>
+        <w:t>Cold Backup Archive</w:t>
+      </w:r>
+      <w:r>
+        <w:rPr>
+          <w:rFonts w:ascii="Times New Roman" w:hAnsi="Times New Roman"/>
+          <w:color w:val="0F172A"/>
+          <w:sz w:val="23"/>
+        </w:rPr>
+        <w:t>: $S_{\text{req}} = \text{Snapshot\_Size\_GB} \times \text{Retention\_Count}$</w:t>
+      </w:r>
+    </w:p>
+    <w:p>
+      <w:pPr>
+        <w:spacing w:before="0" w:after="120" w:line="276" w:lineRule="auto"/>
+      </w:pPr>
+      <w:r>
+        <w:rPr>
+          <w:rFonts w:ascii="Times New Roman" w:hAnsi="Times New Roman"/>
+          <w:color w:val="0F172A"/>
+          <w:sz w:val="23"/>
+        </w:rPr>
+        <w:t xml:space="preserve">2. </w:t>
+      </w:r>
+      <w:r>
+        <w:rPr>
+          <w:rFonts w:ascii="Times New Roman" w:hAnsi="Times New Roman"/>
+          <w:b/>
+          <w:color w:val="0F172A"/>
+          <w:sz w:val="23"/>
+        </w:rPr>
+        <w:t>Multi-Objective Scoring Engine (`allocate_storage`)</w:t>
+      </w:r>
+      <w:r>
+        <w:rPr>
+          <w:rFonts w:ascii="Times New Roman" w:hAnsi="Times New Roman"/>
+          <w:color w:val="0F172A"/>
+          <w:sz w:val="23"/>
+        </w:rPr>
+        <w:t>: Evaluates candidate storage tiers against hard constraints (minimum SLA availability % and maximum access latency ms). For eligible tiers, it computes total estimated cost ($C$) and unavailability ($U = 1.0 - \text{SLA}/100$). It normalizes $C$ and $U$ using Min-Max scaling across candidate tier bounds, evaluates the weighted objective score ($\text{Score} = \alpha \cdot C_{\text{norm}} + \beta \cdot U_{\text{norm}}$), and selects the tier that minimizes this score. It also executes First Fit (FF), Best Fit (BF), and Worst Fit (WF) baseline routines for comparative performance benchmarking.</w:t>
       </w:r>
     </w:p>
     <w:p>
@@ -1025,7 +1252,7 @@
           <w:color w:val="334155"/>
           <w:sz w:val="25"/>
         </w:rPr>
-        <w:t>4.2.4 Interactive Allocation Simulation Module (`modules/allocation.py`)</w:t>
+        <w:t>4.2.4 Interactive Allocation Simulation View (`modules/allocation.py`)</w:t>
       </w:r>
     </w:p>
     <w:p>
@@ -1038,91 +1265,7 @@
           <w:color w:val="0F172A"/>
           <w:sz w:val="23"/>
         </w:rPr>
-        <w:t>Provides input controls (numerical fields and sliders) allowing users to specify workload parameters (required size GB, availability SLA %, max latency ms, budget $, and trade-off weights $\alpha, \beta$). Upon submission, it executes the heuristic algorithm alongside baseline algorithms and renders a comparative analysis table.</w:t>
-      </w:r>
-    </w:p>
-    <w:p>
-      <w:pPr>
-        <w:keepNext/>
-        <w:spacing w:before="240" w:after="80"/>
-      </w:pPr>
-      <w:r>
-        <w:rPr>
-          <w:rFonts w:ascii="Times New Roman" w:hAnsi="Times New Roman"/>
-          <w:b/>
-          <w:color w:val="334155"/>
-          <w:sz w:val="25"/>
-        </w:rPr>
-        <w:t>4.2.5 Executive Dashboard Module (`modules/dashboard.py`)</w:t>
-      </w:r>
-    </w:p>
-    <w:p>
-      <w:pPr>
-        <w:spacing w:before="0" w:after="120" w:line="276" w:lineRule="auto"/>
-      </w:pPr>
-      <w:r>
-        <w:rPr>
-          <w:rFonts w:ascii="Times New Roman" w:hAnsi="Times New Roman"/>
-          <w:color w:val="0F172A"/>
-          <w:sz w:val="23"/>
-        </w:rPr>
-        <w:t>Calculates system-wide Key Performance Indicators (KPIs) from historical allocation logs stored in SQLite, rendering summary metric cards and Plotly distribution charts for storage tier utilization and spend.</w:t>
-      </w:r>
-    </w:p>
-    <w:p>
-      <w:pPr>
-        <w:keepNext/>
-        <w:spacing w:before="240" w:after="80"/>
-      </w:pPr>
-      <w:r>
-        <w:rPr>
-          <w:rFonts w:ascii="Times New Roman" w:hAnsi="Times New Roman"/>
-          <w:b/>
-          <w:color w:val="334155"/>
-          <w:sz w:val="25"/>
-        </w:rPr>
-        <w:t>4.2.6 Performance Monitoring Module (`modules/monitoring.py`)</w:t>
-      </w:r>
-    </w:p>
-    <w:p>
-      <w:pPr>
-        <w:spacing w:before="0" w:after="120" w:line="276" w:lineRule="auto"/>
-      </w:pPr>
-      <w:r>
-        <w:rPr>
-          <w:rFonts w:ascii="Times New Roman" w:hAnsi="Times New Roman"/>
-          <w:color w:val="0F172A"/>
-          <w:sz w:val="23"/>
-        </w:rPr>
-        <w:t>Displays real-time technical specifications for available cloud storage tiers (Block, File, Object), including unit pricing per GB, SLA availability guarantees, and access latency bounds.</w:t>
-      </w:r>
-    </w:p>
-    <w:p>
-      <w:pPr>
-        <w:keepNext/>
-        <w:spacing w:before="240" w:after="80"/>
-      </w:pPr>
-      <w:r>
-        <w:rPr>
-          <w:rFonts w:ascii="Times New Roman" w:hAnsi="Times New Roman"/>
-          <w:b/>
-          <w:color w:val="334155"/>
-          <w:sz w:val="25"/>
-        </w:rPr>
-        <w:t>4.2.7 Reporting &amp; Audit Module (`modules/reporting.py`)</w:t>
-      </w:r>
-    </w:p>
-    <w:p>
-      <w:pPr>
-        <w:spacing w:before="0" w:after="120" w:line="276" w:lineRule="auto"/>
-      </w:pPr>
-      <w:r>
-        <w:rPr>
-          <w:rFonts w:ascii="Times New Roman" w:hAnsi="Times New Roman"/>
-          <w:color w:val="0F172A"/>
-          <w:sz w:val="23"/>
-        </w:rPr>
-        <w:t>Presents a data table of historical storage resource allocation records with multi-column filtering, timestamp sorting, and a one-click CSV export utility.</w:t>
+        <w:t>Combines the Automatic Storage Size Suggestion Engine interface with constraint input controls. Users select workload categories and adjust scale parameters to auto-fill the required storage size field before submitting for dual-objective heuristic evaluation and baseline comparative rendering.</w:t>
       </w:r>
     </w:p>
     <w:p>
@@ -1188,13 +1331,14 @@
     </w:p>
     <w:p>
       <w:pPr>
-        <w:spacing w:before="240" w:after="80"/>
+        <w:keepNext/>
+        <w:spacing w:before="280" w:after="80"/>
         <w:jc w:val="center"/>
       </w:pPr>
       <w:r>
         <w:drawing>
           <wp:inline xmlns:a="http://schemas.openxmlformats.org/drawingml/2006/main" xmlns:pic="http://schemas.openxmlformats.org/drawingml/2006/picture">
-            <wp:extent cx="5486400" cy="3722914"/>
+            <wp:extent cx="5669280" cy="3847011"/>
             <wp:docPr id="1" name="Picture 1"/>
             <wp:cNvGraphicFramePr>
               <a:graphicFrameLocks noChangeAspect="1"/>
@@ -1215,7 +1359,7 @@
                   <pic:spPr>
                     <a:xfrm>
                       <a:off x="0" y="0"/>
-                      <a:ext cx="5486400" cy="3722914"/>
+                      <a:ext cx="5669280" cy="3847011"/>
                     </a:xfrm>
                     <a:prstGeom prst="rect"/>
                   </pic:spPr>
@@ -1228,30 +1372,26 @@
     </w:p>
     <w:p>
       <w:pPr>
-        <w:spacing w:before="40" w:after="240"/>
+        <w:spacing w:before="40" w:after="280"/>
         <w:jc w:val="center"/>
       </w:pPr>
       <w:r>
         <w:rPr>
           <w:rFonts w:ascii="Times New Roman" w:hAnsi="Times New Roman"/>
-          <w:i/>
-          <w:color w:val="475569"/>
+          <w:b/>
+          <w:color w:val="0F172A"/>
           <w:sz w:val="20"/>
         </w:rPr>
-        <w:t>Figure 4.1: Streamlit Executive Dashboard View</w:t>
+        <w:t xml:space="preserve">Figure 4.1: </w:t>
       </w:r>
-    </w:p>
-    <w:p>
-      <w:pPr>
-        <w:spacing w:before="0" w:after="120" w:line="276" w:lineRule="auto"/>
-      </w:pPr>
       <w:r>
         <w:rPr>
           <w:rFonts w:ascii="Times New Roman" w:hAnsi="Times New Roman"/>
-          <w:color w:val="0F172A"/>
-          <w:sz w:val="23"/>
+          <w:i/>
+          <w:color w:val="334155"/>
+          <w:sz w:val="20"/>
         </w:rPr>
-        <w:t>*Figure 4.1: Streamlit Executive Dashboard View displaying system KPI metric cards and Plotly distribution charts.*</w:t>
+        <w:t>Streamlit Executive Dashboard View displaying system KPI metric cards and Plotly distribution charts</w:t>
       </w:r>
     </w:p>
     <w:p>
@@ -1271,7 +1411,7 @@
           <w:color w:val="334155"/>
           <w:sz w:val="25"/>
         </w:rPr>
-        <w:t>4.3.2 Allocation Simulation &amp; Baseline Trade-Off Interface</w:t>
+        <w:t>4.3.2 Allocation Simulation &amp; Automatic Storage Sizing Interface</w:t>
       </w:r>
     </w:p>
     <w:p>
@@ -1284,18 +1424,36 @@
           <w:color w:val="0F172A"/>
           <w:sz w:val="23"/>
         </w:rPr>
-        <w:t>The Allocation Simulation screen features interactive controls for specifying storage volume requirements, SLA availability constraints, latency limits, budget ceilings, and the $\alpha/\beta$ cost-versus-availability weight slider. Upon calculation, it displays the recommended tier alongside a comparative evaluation against First Fit, Best Fit, and Worst Fit baseline policies.</w:t>
+        <w:t xml:space="preserve">The Allocation Simulation screen features the </w:t>
+      </w:r>
+      <w:r>
+        <w:rPr>
+          <w:rFonts w:ascii="Times New Roman" w:hAnsi="Times New Roman"/>
+          <w:b/>
+          <w:color w:val="0F172A"/>
+          <w:sz w:val="23"/>
+        </w:rPr>
+        <w:t>Automatic Storage Size Suggestion Engine</w:t>
+      </w:r>
+      <w:r>
+        <w:rPr>
+          <w:rFonts w:ascii="Times New Roman" w:hAnsi="Times New Roman"/>
+          <w:color w:val="0F172A"/>
+          <w:sz w:val="23"/>
+        </w:rPr>
+        <w:t xml:space="preserve"> at the top, allowing users to select enterprise workload categories (e.g., IoT Log Analytics, Relational DB) and scale parameters (devices, retention days, log rates). The calculated recommendation automatically populates the storage size field. Users adjust SLA constraints, latency limits, budget ceilings, and the $\alpha/\beta$ weight slider before running the multi-objective heuristic and baseline comparisons.</w:t>
       </w:r>
     </w:p>
     <w:p>
       <w:pPr>
-        <w:spacing w:before="240" w:after="80"/>
+        <w:keepNext/>
+        <w:spacing w:before="280" w:after="80"/>
         <w:jc w:val="center"/>
       </w:pPr>
       <w:r>
         <w:drawing>
           <wp:inline xmlns:a="http://schemas.openxmlformats.org/drawingml/2006/main" xmlns:pic="http://schemas.openxmlformats.org/drawingml/2006/picture">
-            <wp:extent cx="5486400" cy="3722914"/>
+            <wp:extent cx="5669280" cy="3847011"/>
             <wp:docPr id="2" name="Picture 2"/>
             <wp:cNvGraphicFramePr>
               <a:graphicFrameLocks noChangeAspect="1"/>
@@ -1316,7 +1474,7 @@
                   <pic:spPr>
                     <a:xfrm>
                       <a:off x="0" y="0"/>
-                      <a:ext cx="5486400" cy="3722914"/>
+                      <a:ext cx="5669280" cy="3847011"/>
                     </a:xfrm>
                     <a:prstGeom prst="rect"/>
                   </pic:spPr>
@@ -1329,30 +1487,26 @@
     </w:p>
     <w:p>
       <w:pPr>
-        <w:spacing w:before="40" w:after="240"/>
+        <w:spacing w:before="40" w:after="280"/>
         <w:jc w:val="center"/>
       </w:pPr>
       <w:r>
         <w:rPr>
           <w:rFonts w:ascii="Times New Roman" w:hAnsi="Times New Roman"/>
-          <w:i/>
-          <w:color w:val="475569"/>
+          <w:b/>
+          <w:color w:val="0F172A"/>
           <w:sz w:val="20"/>
         </w:rPr>
-        <w:t>Figure 4.2: Storage Resource Allocation Simulation &amp; Trade-Off View</w:t>
+        <w:t xml:space="preserve">Figure 4.2: </w:t>
       </w:r>
-    </w:p>
-    <w:p>
-      <w:pPr>
-        <w:spacing w:before="0" w:after="120" w:line="276" w:lineRule="auto"/>
-      </w:pPr>
       <w:r>
         <w:rPr>
           <w:rFonts w:ascii="Times New Roman" w:hAnsi="Times New Roman"/>
-          <w:color w:val="0F172A"/>
-          <w:sz w:val="23"/>
+          <w:i/>
+          <w:color w:val="334155"/>
+          <w:sz w:val="20"/>
         </w:rPr>
-        <w:t>*Figure 4.2: Storage Resource Allocation Simulation &amp; Trade-Off View with interactive parameter controls and comparative baseline output.*</w:t>
+        <w:t>Storage Resource Allocation Simulation View showing the Automatic Storage Size Suggestion Engine and baseline comparative results</w:t>
       </w:r>
     </w:p>
     <w:p>
@@ -1390,13 +1544,14 @@
     </w:p>
     <w:p>
       <w:pPr>
-        <w:spacing w:before="240" w:after="80"/>
+        <w:keepNext/>
+        <w:spacing w:before="280" w:after="80"/>
         <w:jc w:val="center"/>
       </w:pPr>
       <w:r>
         <w:drawing>
           <wp:inline xmlns:a="http://schemas.openxmlformats.org/drawingml/2006/main" xmlns:pic="http://schemas.openxmlformats.org/drawingml/2006/picture">
-            <wp:extent cx="5486400" cy="3722914"/>
+            <wp:extent cx="5669280" cy="3847011"/>
             <wp:docPr id="3" name="Picture 3"/>
             <wp:cNvGraphicFramePr>
               <a:graphicFrameLocks noChangeAspect="1"/>
@@ -1417,7 +1572,7 @@
                   <pic:spPr>
                     <a:xfrm>
                       <a:off x="0" y="0"/>
-                      <a:ext cx="5486400" cy="3722914"/>
+                      <a:ext cx="5669280" cy="3847011"/>
                     </a:xfrm>
                     <a:prstGeom prst="rect"/>
                   </pic:spPr>
@@ -1430,30 +1585,26 @@
     </w:p>
     <w:p>
       <w:pPr>
-        <w:spacing w:before="40" w:after="240"/>
+        <w:spacing w:before="40" w:after="280"/>
         <w:jc w:val="center"/>
       </w:pPr>
       <w:r>
         <w:rPr>
           <w:rFonts w:ascii="Times New Roman" w:hAnsi="Times New Roman"/>
-          <w:i/>
-          <w:color w:val="475569"/>
+          <w:b/>
+          <w:color w:val="0F172A"/>
           <w:sz w:val="20"/>
         </w:rPr>
-        <w:t>Figure 4.3: Tier Performance Monitoring &amp; SLA Compliance View</w:t>
+        <w:t xml:space="preserve">Figure 4.3: </w:t>
       </w:r>
-    </w:p>
-    <w:p>
-      <w:pPr>
-        <w:spacing w:before="0" w:after="120" w:line="276" w:lineRule="auto"/>
-      </w:pPr>
       <w:r>
         <w:rPr>
           <w:rFonts w:ascii="Times New Roman" w:hAnsi="Times New Roman"/>
-          <w:color w:val="0F172A"/>
-          <w:sz w:val="23"/>
+          <w:i/>
+          <w:color w:val="334155"/>
+          <w:sz w:val="20"/>
         </w:rPr>
-        <w:t>*Figure 4.3: Tier Performance Monitoring &amp; SLA Compliance View showing storage tier specifications and SLA constraints.*</w:t>
+        <w:t>Tier Performance Monitoring &amp; SLA Compliance View showing storage tier specifications and SLA constraints</w:t>
       </w:r>
     </w:p>
     <w:p>
@@ -1491,13 +1642,14 @@
     </w:p>
     <w:p>
       <w:pPr>
-        <w:spacing w:before="240" w:after="80"/>
+        <w:keepNext/>
+        <w:spacing w:before="280" w:after="80"/>
         <w:jc w:val="center"/>
       </w:pPr>
       <w:r>
         <w:drawing>
           <wp:inline xmlns:a="http://schemas.openxmlformats.org/drawingml/2006/main" xmlns:pic="http://schemas.openxmlformats.org/drawingml/2006/picture">
-            <wp:extent cx="5486400" cy="3722914"/>
+            <wp:extent cx="5669280" cy="3847011"/>
             <wp:docPr id="4" name="Picture 4"/>
             <wp:cNvGraphicFramePr>
               <a:graphicFrameLocks noChangeAspect="1"/>
@@ -1518,7 +1670,7 @@
                   <pic:spPr>
                     <a:xfrm>
                       <a:off x="0" y="0"/>
-                      <a:ext cx="5486400" cy="3722914"/>
+                      <a:ext cx="5669280" cy="3847011"/>
                     </a:xfrm>
                     <a:prstGeom prst="rect"/>
                   </pic:spPr>
@@ -1531,30 +1683,26 @@
     </w:p>
     <w:p>
       <w:pPr>
-        <w:spacing w:before="40" w:after="240"/>
+        <w:spacing w:before="40" w:after="280"/>
         <w:jc w:val="center"/>
       </w:pPr>
       <w:r>
         <w:rPr>
           <w:rFonts w:ascii="Times New Roman" w:hAnsi="Times New Roman"/>
-          <w:i/>
-          <w:color w:val="475569"/>
+          <w:b/>
+          <w:color w:val="0F172A"/>
           <w:sz w:val="20"/>
         </w:rPr>
-        <w:t>Figure 4.4: Allocation Reporting &amp; Log Analytics View</w:t>
+        <w:t xml:space="preserve">Figure 4.4: </w:t>
       </w:r>
-    </w:p>
-    <w:p>
-      <w:pPr>
-        <w:spacing w:before="0" w:after="120" w:line="276" w:lineRule="auto"/>
-      </w:pPr>
       <w:r>
         <w:rPr>
           <w:rFonts w:ascii="Times New Roman" w:hAnsi="Times New Roman"/>
-          <w:color w:val="0F172A"/>
-          <w:sz w:val="23"/>
+          <w:i/>
+          <w:color w:val="334155"/>
+          <w:sz w:val="20"/>
         </w:rPr>
-        <w:t>*Figure 4.4: Allocation Reporting &amp; Log Analytics View showing historical allocation logs and CSV export control.*</w:t>
+        <w:t>Allocation Reporting &amp; Log Analytics View showing historical allocation logs and CSV export control</w:t>
       </w:r>
     </w:p>
     <w:p>
@@ -1589,7 +1737,7 @@
           <w:color w:val="334155"/>
           <w:sz w:val="25"/>
         </w:rPr>
-        <w:t>Code Walkthrough 4.1: Multi-Objective Min-Max Scoring Algorithm (`heuristic.py`)</w:t>
+        <w:t>Code Walkthrough 4.1: Workload Auto-Suggest Engine &amp; Min-Max Scoring (`heuristic.py`)</w:t>
       </w:r>
     </w:p>
     <w:p>
@@ -1602,7 +1750,7 @@
           <w:color w:val="0F172A"/>
           <w:sz w:val="23"/>
         </w:rPr>
-        <w:t>The `allocate_storage` function implements the core scoring model. Hard constraints filter out non-compliant tiers, followed by total cost evaluation, budget validation, Min-Max normalization, and weighted score minimization:</w:t>
+        <w:t>Demonstrates automated workload profile size calculation and multi-objective scoring logic:</w:t>
       </w:r>
     </w:p>
     <w:tbl>
@@ -1636,6 +1784,51 @@
                 <w:color w:val="1E293B"/>
                 <w:sz w:val="19"/>
               </w:rPr>
+              <w:t>def suggest_workload_size(workload_category, params):</w:t>
+              <w:br/>
+              <w:t xml:space="preserve">    """</w:t>
+              <w:br/>
+              <w:t xml:space="preserve">    Automatically calculates suggested storage capacity (in GB) based on workload profiles.</w:t>
+              <w:br/>
+              <w:t xml:space="preserve">    """</w:t>
+              <w:br/>
+              <w:t xml:space="preserve">    if workload_category == "Enterprise Relational Database (OLTP)":</w:t>
+              <w:br/>
+              <w:t xml:space="preserve">        users = params.get("users", 1000)</w:t>
+              <w:br/>
+              <w:t xml:space="preserve">        transactions = params.get("transactions", 50000)</w:t>
+              <w:br/>
+              <w:t xml:space="preserve">        return round(20.0 + (users * 0.05) + (transactions * 0.0001), 2)</w:t>
+              <w:br/>
+              <w:t xml:space="preserve">        </w:t>
+              <w:br/>
+              <w:t xml:space="preserve">    elif workload_category == "IoT Sensor &amp; Log Analytics":</w:t>
+              <w:br/>
+              <w:t xml:space="preserve">        devices = params.get("devices", 500)</w:t>
+              <w:br/>
+              <w:t xml:space="preserve">        daily_log_mb = params.get("daily_log_mb", 50.0)</w:t>
+              <w:br/>
+              <w:t xml:space="preserve">        retention_days = params.get("retention_days", 90)</w:t>
+              <w:br/>
+              <w:t xml:space="preserve">        total_mb = devices * daily_log_mb * retention_days</w:t>
+              <w:br/>
+              <w:t xml:space="preserve">        return round(total_mb / 1024.0, 2)</w:t>
+              <w:br/>
+              <w:t xml:space="preserve">        </w:t>
+              <w:br/>
+              <w:t xml:space="preserve">    elif workload_category == "Cold Backup &amp; System Archive":</w:t>
+              <w:br/>
+              <w:t xml:space="preserve">        snapshot_gb = params.get("snapshot_gb", 500.0)</w:t>
+              <w:br/>
+              <w:t xml:space="preserve">        retention_count = params.get("retention_count", 6)</w:t>
+              <w:br/>
+              <w:t xml:space="preserve">        return round(snapshot_gb * retention_count, 2)</w:t>
+              <w:br/>
+              <w:t xml:space="preserve">        </w:t>
+              <w:br/>
+              <w:t xml:space="preserve">    return 100.0</w:t>
+              <w:br/>
+              <w:br/>
               <w:t>def allocate_storage(required_size, availability_req, latency_req, budget=None, alpha=0.5, beta=0.5):</w:t>
               <w:br/>
               <w:t xml:space="preserve">    tiers_df = get_storage_tiers()</w:t>
@@ -1666,28 +1859,6 @@
               <w:br/>
               <w:t xml:space="preserve">    </w:t>
               <w:br/>
-              <w:t xml:space="preserve">    # Budget constraint enforcement</w:t>
-              <w:br/>
-              <w:t xml:space="preserve">    if budget is not None and budget &gt; 0:</w:t>
-              <w:br/>
-              <w:t xml:space="preserve">        budget_eligible = eligible_tiers[eligible_tiers['total_cost'] &lt;= budget]</w:t>
-              <w:br/>
-              <w:t xml:space="preserve">        if budget_eligible.empty:</w:t>
-              <w:br/>
-              <w:t xml:space="preserve">            min_cost_tier = eligible_tiers.loc[eligible_tiers['total_cost'].idxmin()]</w:t>
-              <w:br/>
-              <w:t xml:space="preserve">            return {</w:t>
-              <w:br/>
-              <w:t xml:space="preserve">                "success": False,</w:t>
-              <w:br/>
-              <w:t xml:space="preserve">                "message": f"No tier meets requirements within budget. Closest option: {min_cost_tier['name']} at ${min_cost_tier['total_cost']:.2f}"</w:t>
-              <w:br/>
-              <w:t xml:space="preserve">            }</w:t>
-              <w:br/>
-              <w:t xml:space="preserve">        eligible_tiers = budget_eligible.copy()</w:t>
-              <w:br/>
-              <w:t xml:space="preserve">        </w:t>
-              <w:br/>
               <w:t xml:space="preserve">    # Min-Max Normalization phase</w:t>
               <w:br/>
               <w:t xml:space="preserve">    eligible_tiers['unavailability'] = 1.0 - (eligible_tiers['sla_availability'] / 100.0)</w:t>
@@ -1705,8 +1876,6 @@
               <w:t xml:space="preserve">    unavail_range = max_unavail - min_unavail</w:t>
               <w:br/>
               <w:t xml:space="preserve">    </w:t>
-              <w:br/>
-              <w:t xml:space="preserve">    # Weighted score calculation</w:t>
               <w:br/>
               <w:t xml:space="preserve">    scores = []</w:t>
               <w:br/>
@@ -1738,9 +1907,7 @@
               <w:br/>
               <w:t xml:space="preserve">        "availability_prediction": float(best_tier['sla_availability']),</w:t>
               <w:br/>
-              <w:t xml:space="preserve">        "latency_prediction": float(best_tier['access_latency']),</w:t>
-              <w:br/>
-              <w:t xml:space="preserve">        "score": float(best_tier['score'])</w:t>
+              <w:t xml:space="preserve">        "latency_prediction": float(best_tier['access_latency'])</w:t>
               <w:br/>
               <w:t xml:space="preserve">    }</w:t>
             </w:r>
@@ -1770,7 +1937,7 @@
           <w:color w:val="334155"/>
           <w:sz w:val="25"/>
         </w:rPr>
-        <w:t>Code Walkthrough 4.2: Streamlit Interactive Allocation &amp; Baseline Controller (`modules/allocation.py`)</w:t>
+        <w:t>Code Walkthrough 4.2: Streamlit Interactive Auto-Suggest &amp; Simulation Module (`modules/allocation.py`)</w:t>
       </w:r>
     </w:p>
     <w:p>
@@ -1783,7 +1950,7 @@
           <w:color w:val="0F172A"/>
           <w:sz w:val="23"/>
         </w:rPr>
-        <w:t>This module captures user form parameters, executes both the heuristic optimization and baseline algorithms, logs successful allocations to SQLite, and renders the baseline comparison table:</w:t>
+        <w:t>This module renders the workload profile parameter selector, computes the automated storage size suggestion, populates the input form, and renders baseline comparative results:</w:t>
       </w:r>
     </w:p>
     <w:tbl>
@@ -1817,176 +1984,42 @@
                 <w:color w:val="1E293B"/>
                 <w:sz w:val="19"/>
               </w:rPr>
-              <w:t>def app():</w:t>
+              <w:t>category = st.selectbox("Select Workload Profile Category", options=[</w:t>
               <w:br/>
-              <w:t xml:space="preserve">    st.title("⚡ Storage Resource Allocation Simulation")</w:t>
+              <w:t xml:space="preserve">    "Enterprise Relational Database (OLTP)",</w:t>
               <w:br/>
-              <w:t xml:space="preserve">    </w:t>
+              <w:t xml:space="preserve">    "HD Video &amp; Media Streaming",</w:t>
               <w:br/>
-              <w:t xml:space="preserve">    with st.form("allocation_form"):</w:t>
+              <w:t xml:space="preserve">    "IoT Sensor &amp; Log Analytics",</w:t>
               <w:br/>
-              <w:t xml:space="preserve">        col1, col2 = st.columns(2)</w:t>
+              <w:t xml:space="preserve">    "Document &amp; Content Management (CMS)",</w:t>
               <w:br/>
-              <w:t xml:space="preserve">        with col1:</w:t>
+              <w:t xml:space="preserve">    "Cold Backup &amp; System Archive"</w:t>
               <w:br/>
-              <w:t xml:space="preserve">            req_size = st.number_input("Required Storage Size (GB)", min_value=1.0, value=500.0, step=50.0)</w:t>
+              <w:t>])</w:t>
               <w:br/>
-              <w:t xml:space="preserve">            availability_req = st.number_input("Minimum Availability SLA (%)", min_value=90.0, max_value=99.999, value=99.9, step=0.01)</w:t>
               <w:br/>
-              <w:t xml:space="preserve">            latency_req = st.number_input("Maximum Access Latency (ms)", min_value=1.0, max_value=100.0, value=20.0, step=1.0)</w:t>
+              <w:t># Capture scale parameters based on workload selection</w:t>
               <w:br/>
-              <w:t xml:space="preserve">        with col2:</w:t>
+              <w:t>params = {}</w:t>
               <w:br/>
-              <w:t xml:space="preserve">            budget = st.number_input("Max Budget Ceiling ($) (0 = No Limit)", min_value=0.0, value=100.0, step=10.0)</w:t>
+              <w:t>if category == "IoT Sensor &amp; Log Analytics":</w:t>
               <w:br/>
-              <w:t xml:space="preserve">            alpha = st.slider("Cost Optimization Weight (α)", min_value=0.0, max_value=1.0, value=0.5, step=0.1)</w:t>
+              <w:t xml:space="preserve">    params["devices"] = st.number_input("Connected IoT Devices", value=750)</w:t>
               <w:br/>
-              <w:t xml:space="preserve">            beta = round(1.0 - alpha, 2)</w:t>
+              <w:t xml:space="preserve">    params["daily_log_mb"] = st.number_input("Daily Log Output (MB)", value=40.0)</w:t>
               <w:br/>
-              <w:t xml:space="preserve">            st.caption(f"Availability Weight (β): {beta}")</w:t>
+              <w:t xml:space="preserve">    params["retention_days"] = st.number_input("Retention Period (Days)", value=120)</w:t>
               <w:br/>
-              <w:t xml:space="preserve">            </w:t>
               <w:br/>
-              <w:t xml:space="preserve">        submitted = st.form_submit_button("Run Allocation Optimizer")</w:t>
+              <w:t>suggested_gb = heuristic.suggest_workload_size(category, params)</w:t>
               <w:br/>
-              <w:t xml:space="preserve">        </w:t>
+              <w:t>st.info(f"💡 **Automated Storage Recommendation**: **{suggested_gb:,.2f} GB** calculated for **{category}**.")</w:t>
               <w:br/>
-              <w:t xml:space="preserve">    if submitted:</w:t>
               <w:br/>
-              <w:t xml:space="preserve">        result = heuristic.allocate_storage(req_size, availability_req, latency_req, budget if budget &gt; 0 else None, alpha, beta)</w:t>
+              <w:t># Required storage size field pre-filled with suggested_gb</w:t>
               <w:br/>
-              <w:t xml:space="preserve">        if result["success"]:</w:t>
-              <w:br/>
-              <w:t xml:space="preserve">            st.success(f"**Recommended Tier**: {result['tier_name']} | Estimated Cost: **${result['cost_estimate']:.2f}**")</w:t>
-              <w:br/>
-              <w:t xml:space="preserve">            database.save_allocation(req_size, availability_req, latency_req, budget if budget &gt; 0 else None,</w:t>
-              <w:br/>
-              <w:t xml:space="preserve">                                     alpha, beta, result['tier_id'], result['cost_estimate'],</w:t>
-              <w:br/>
-              <w:t xml:space="preserve">                                     result['availability_prediction'], result['latency_prediction'])</w:t>
-              <w:br/>
-              <w:t xml:space="preserve">            </w:t>
-              <w:br/>
-              <w:t xml:space="preserve">            # Compute baseline comparative benchmarks</w:t>
-              <w:br/>
-              <w:t xml:space="preserve">            tiers_df = database.get_storage_tiers()</w:t>
-              <w:br/>
-              <w:t xml:space="preserve">            ff = heuristic.allocate_first_fit(tiers_df, req_size, availability_req, latency_req)</w:t>
-              <w:br/>
-              <w:t xml:space="preserve">            bf = heuristic.allocate_best_fit(tiers_df, req_size, availability_req, latency_req)</w:t>
-              <w:br/>
-              <w:t xml:space="preserve">            wf = heuristic.allocate_worst_fit(tiers_df, req_size, availability_req, latency_req)</w:t>
-              <w:br/>
-              <w:t xml:space="preserve">            </w:t>
-              <w:br/>
-              <w:t xml:space="preserve">            comp_data = [</w:t>
-              <w:br/>
-              <w:t xml:space="preserve">                {"Algorithm": "Proposed Heuristic", "Recommended Tier": result['tier_name'], "Cost ($)": f"${result['cost_estimate']:.2f}", "SLA (%)": f"{result['availability_prediction']}%"},</w:t>
-              <w:br/>
-              <w:t xml:space="preserve">                {"Algorithm": "First Fit (FF)", "Recommended Tier": ff['tier_name'], "Cost ($)": f"${ff['cost_estimate']:.2f}", "SLA (%)": f"{ff['availability_prediction']}%"},</w:t>
-              <w:br/>
-              <w:t xml:space="preserve">                {"Algorithm": "Best Fit (BF)", "Recommended Tier": bf['tier_name'], "Cost ($)": f"${bf['cost_estimate']:.2f}", "SLA (%)": f"{bf['availability_prediction']}%"},</w:t>
-              <w:br/>
-              <w:t xml:space="preserve">                {"Algorithm": "Worst Fit (WF)", "Recommended Tier": wf['tier_name'], "Cost ($)": f"${wf['cost_estimate']:.2f}", "SLA (%)": f"{wf['availability_prediction']}%"}</w:t>
-              <w:br/>
-              <w:t xml:space="preserve">            ]</w:t>
-              <w:br/>
-              <w:t xml:space="preserve">            st.table(pd.DataFrame(comp_data))</w:t>
-            </w:r>
-          </w:p>
-        </w:tc>
-      </w:tr>
-    </w:tbl>
-    <w:p>
-      <w:pPr>
-        <w:spacing w:after="120"/>
-      </w:pPr>
-    </w:p>
-    <w:p>
-      <w:pPr>
-        <w:spacing w:before="160" w:after="160"/>
-      </w:pPr>
-    </w:p>
-    <w:p>
-      <w:pPr>
-        <w:keepNext/>
-        <w:spacing w:before="240" w:after="80"/>
-      </w:pPr>
-      <w:r>
-        <w:rPr>
-          <w:rFonts w:ascii="Times New Roman" w:hAnsi="Times New Roman"/>
-          <w:b/>
-          <w:color w:val="334155"/>
-          <w:sz w:val="25"/>
-        </w:rPr>
-        <w:t>Code Walkthrough 4.3: SQLite Parameterized Data Access Layer (`database.py`)</w:t>
-      </w:r>
-    </w:p>
-    <w:p>
-      <w:pPr>
-        <w:spacing w:before="0" w:after="120" w:line="276" w:lineRule="auto"/>
-      </w:pPr>
-      <w:r>
-        <w:rPr>
-          <w:rFonts w:ascii="Times New Roman" w:hAnsi="Times New Roman"/>
-          <w:color w:val="0F172A"/>
-          <w:sz w:val="23"/>
-        </w:rPr>
-        <w:t>Demonstrates secure data initialization and transaction logging using parameterized SQL bindings:</w:t>
-      </w:r>
-    </w:p>
-    <w:tbl>
-      <w:tblPr>
-        <w:tblW w:type="auto" w:w="0"/>
-        <w:jc w:val="center"/>
-        <w:tblLook w:firstColumn="1" w:firstRow="1" w:lastColumn="0" w:lastRow="0" w:noHBand="0" w:noVBand="1" w:val="04A0"/>
-      </w:tblPr>
-      <w:tblGrid>
-        <w:gridCol w:w="9360"/>
-      </w:tblGrid>
-      <w:tr>
-        <w:tc>
-          <w:tcPr>
-            <w:tcW w:type="dxa" w:w="9360"/>
-            <w:shd w:fill="F1F5F9"/>
-            <w:tcMar>
-              <w:top w:w="140" w:type="dxa"/>
-              <w:bottom w:w="140" w:type="dxa"/>
-              <w:left w:w="180" w:type="dxa"/>
-              <w:right w:w="180" w:type="dxa"/>
-            </w:tcMar>
-          </w:tcPr>
-          <w:p>
-            <w:pPr>
-              <w:spacing w:before="80" w:after="80" w:line="252" w:lineRule="auto"/>
-            </w:pPr>
-            <w:r>
-              <w:rPr>
-                <w:rFonts w:ascii="Consolas" w:hAnsi="Consolas"/>
-                <w:color w:val="1E293B"/>
-                <w:sz w:val="19"/>
-              </w:rPr>
-              <w:t>def save_allocation(required_size, availability_req, latency_req, budget, alpha, beta, tier_id, cost_estimate, availability_prediction, latency_prediction):</w:t>
-              <w:br/>
-              <w:t xml:space="preserve">    conn = get_connection()</w:t>
-              <w:br/>
-              <w:t xml:space="preserve">    cursor = conn.cursor()</w:t>
-              <w:br/>
-              <w:t xml:space="preserve">    created_at = datetime.now().isoformat()</w:t>
-              <w:br/>
-              <w:t xml:space="preserve">    cursor.execute("""</w:t>
-              <w:br/>
-              <w:t xml:space="preserve">        INSERT INTO allocations </w:t>
-              <w:br/>
-              <w:t xml:space="preserve">        (required_size, availability_req, latency_req, budget, alpha, beta, recommended_tier_id, cost_estimate, availability_prediction, latency_prediction, created_at)</w:t>
-              <w:br/>
-              <w:t xml:space="preserve">        VALUES (?, ?, ?, ?, ?, ?, ?, ?, ?, ?, ?)</w:t>
-              <w:br/>
-              <w:t xml:space="preserve">    """, (required_size, availability_req, latency_req, budget, alpha, beta, tier_id, cost_estimate, availability_prediction, latency_prediction, created_at))</w:t>
-              <w:br/>
-              <w:t xml:space="preserve">    conn.commit()</w:t>
-              <w:br/>
-              <w:t xml:space="preserve">    conn.close()</w:t>
+              <w:t>required_size = st.number_input("Required Storage Size (GB)", value=float(suggested_gb))</w:t>
             </w:r>
           </w:p>
         </w:tc>
@@ -2027,7 +2060,7 @@
           <w:color w:val="0F172A"/>
           <w:sz w:val="23"/>
         </w:rPr>
-        <w:t>The system underwent rigorous empirical testing covering algorithmic logic, constraint filtering, budget enforcement, database persistence, baseline comparisons, and edge-case handling.</w:t>
+        <w:t>The system underwent empirical testing covering algorithmic logic, constraint filtering, workload estimation formulas, budget enforcement, database persistence, baseline comparisons, and edge-case handling.</w:t>
       </w:r>
     </w:p>
     <w:p>
@@ -3708,6 +3741,310 @@
                 <w:sz w:val="20"/>
               </w:rPr>
               <w:t>500 allocations logged cleanly (mean latency 2.8ms)</w:t>
+            </w:r>
+          </w:p>
+        </w:tc>
+        <w:tc>
+          <w:tcPr>
+            <w:tcW w:type="dxa" w:w="1560"/>
+            <w:shd w:fill="F8FAFC"/>
+            <w:tcMar>
+              <w:top w:w="100" w:type="dxa"/>
+              <w:bottom w:w="100" w:type="dxa"/>
+              <w:left w:w="150" w:type="dxa"/>
+              <w:right w:w="150" w:type="dxa"/>
+            </w:tcMar>
+          </w:tcPr>
+          <w:p>
+            <w:pPr>
+              <w:jc w:val="left"/>
+            </w:pPr>
+            <w:r>
+              <w:rPr>
+                <w:rFonts w:ascii="Times New Roman" w:hAnsi="Times New Roman"/>
+                <w:color w:val="0F172A"/>
+                <w:sz w:val="20"/>
+              </w:rPr>
+              <w:t>**PASS**</w:t>
+            </w:r>
+          </w:p>
+        </w:tc>
+      </w:tr>
+      <w:tr>
+        <w:tc>
+          <w:tcPr>
+            <w:tcW w:type="dxa" w:w="1560"/>
+            <w:shd w:fill="FFFFFF"/>
+            <w:tcMar>
+              <w:top w:w="100" w:type="dxa"/>
+              <w:bottom w:w="100" w:type="dxa"/>
+              <w:left w:w="150" w:type="dxa"/>
+              <w:right w:w="150" w:type="dxa"/>
+            </w:tcMar>
+          </w:tcPr>
+          <w:p>
+            <w:pPr>
+              <w:jc w:val="left"/>
+            </w:pPr>
+            <w:r>
+              <w:rPr>
+                <w:rFonts w:ascii="Times New Roman" w:hAnsi="Times New Roman"/>
+                <w:color w:val="0F172A"/>
+                <w:sz w:val="20"/>
+              </w:rPr>
+              <w:t>**TC-11**</w:t>
+            </w:r>
+          </w:p>
+        </w:tc>
+        <w:tc>
+          <w:tcPr>
+            <w:tcW w:type="dxa" w:w="1560"/>
+            <w:shd w:fill="FFFFFF"/>
+            <w:tcMar>
+              <w:top w:w="100" w:type="dxa"/>
+              <w:bottom w:w="100" w:type="dxa"/>
+              <w:left w:w="150" w:type="dxa"/>
+              <w:right w:w="150" w:type="dxa"/>
+            </w:tcMar>
+          </w:tcPr>
+          <w:p>
+            <w:pPr>
+              <w:jc w:val="left"/>
+            </w:pPr>
+            <w:r>
+              <w:rPr>
+                <w:rFonts w:ascii="Times New Roman" w:hAnsi="Times New Roman"/>
+                <w:color w:val="0F172A"/>
+                <w:sz w:val="20"/>
+              </w:rPr>
+              <w:t>Auto-Suggest Engine</w:t>
+            </w:r>
+          </w:p>
+        </w:tc>
+        <w:tc>
+          <w:tcPr>
+            <w:tcW w:type="dxa" w:w="1560"/>
+            <w:shd w:fill="FFFFFF"/>
+            <w:tcMar>
+              <w:top w:w="100" w:type="dxa"/>
+              <w:bottom w:w="100" w:type="dxa"/>
+              <w:left w:w="150" w:type="dxa"/>
+              <w:right w:w="150" w:type="dxa"/>
+            </w:tcMar>
+          </w:tcPr>
+          <w:p>
+            <w:pPr>
+              <w:jc w:val="left"/>
+            </w:pPr>
+            <w:r>
+              <w:rPr>
+                <w:rFonts w:ascii="Times New Roman" w:hAnsi="Times New Roman"/>
+                <w:color w:val="0F172A"/>
+                <w:sz w:val="20"/>
+              </w:rPr>
+              <w:t>Calculate storage size for 750 IoT devices, 40MB/day, 120 days retention</w:t>
+            </w:r>
+          </w:p>
+        </w:tc>
+        <w:tc>
+          <w:tcPr>
+            <w:tcW w:type="dxa" w:w="1560"/>
+            <w:shd w:fill="FFFFFF"/>
+            <w:tcMar>
+              <w:top w:w="100" w:type="dxa"/>
+              <w:bottom w:w="100" w:type="dxa"/>
+              <w:left w:w="150" w:type="dxa"/>
+              <w:right w:w="150" w:type="dxa"/>
+            </w:tcMar>
+          </w:tcPr>
+          <w:p>
+            <w:pPr>
+              <w:jc w:val="left"/>
+            </w:pPr>
+            <w:r>
+              <w:rPr>
+                <w:rFonts w:ascii="Times New Roman" w:hAnsi="Times New Roman"/>
+                <w:color w:val="0F172A"/>
+                <w:sz w:val="20"/>
+              </w:rPr>
+              <w:t>$S_{\text{req}} = (750 \times 40 \times 120)/1024 = 3,515.62\text{ GB}$</w:t>
+            </w:r>
+          </w:p>
+        </w:tc>
+        <w:tc>
+          <w:tcPr>
+            <w:tcW w:type="dxa" w:w="1560"/>
+            <w:shd w:fill="FFFFFF"/>
+            <w:tcMar>
+              <w:top w:w="100" w:type="dxa"/>
+              <w:bottom w:w="100" w:type="dxa"/>
+              <w:left w:w="150" w:type="dxa"/>
+              <w:right w:w="150" w:type="dxa"/>
+            </w:tcMar>
+          </w:tcPr>
+          <w:p>
+            <w:pPr>
+              <w:jc w:val="left"/>
+            </w:pPr>
+            <w:r>
+              <w:rPr>
+                <w:rFonts w:ascii="Times New Roman" w:hAnsi="Times New Roman"/>
+                <w:color w:val="0F172A"/>
+                <w:sz w:val="20"/>
+              </w:rPr>
+              <w:t>Auto-calculated 3,515.62 GB correctly</w:t>
+            </w:r>
+          </w:p>
+        </w:tc>
+        <w:tc>
+          <w:tcPr>
+            <w:tcW w:type="dxa" w:w="1560"/>
+            <w:shd w:fill="FFFFFF"/>
+            <w:tcMar>
+              <w:top w:w="100" w:type="dxa"/>
+              <w:bottom w:w="100" w:type="dxa"/>
+              <w:left w:w="150" w:type="dxa"/>
+              <w:right w:w="150" w:type="dxa"/>
+            </w:tcMar>
+          </w:tcPr>
+          <w:p>
+            <w:pPr>
+              <w:jc w:val="left"/>
+            </w:pPr>
+            <w:r>
+              <w:rPr>
+                <w:rFonts w:ascii="Times New Roman" w:hAnsi="Times New Roman"/>
+                <w:color w:val="0F172A"/>
+                <w:sz w:val="20"/>
+              </w:rPr>
+              <w:t>**PASS**</w:t>
+            </w:r>
+          </w:p>
+        </w:tc>
+      </w:tr>
+      <w:tr>
+        <w:tc>
+          <w:tcPr>
+            <w:tcW w:type="dxa" w:w="1560"/>
+            <w:shd w:fill="F8FAFC"/>
+            <w:tcMar>
+              <w:top w:w="100" w:type="dxa"/>
+              <w:bottom w:w="100" w:type="dxa"/>
+              <w:left w:w="150" w:type="dxa"/>
+              <w:right w:w="150" w:type="dxa"/>
+            </w:tcMar>
+          </w:tcPr>
+          <w:p>
+            <w:pPr>
+              <w:jc w:val="left"/>
+            </w:pPr>
+            <w:r>
+              <w:rPr>
+                <w:rFonts w:ascii="Times New Roman" w:hAnsi="Times New Roman"/>
+                <w:color w:val="0F172A"/>
+                <w:sz w:val="20"/>
+              </w:rPr>
+              <w:t>**TC-12**</w:t>
+            </w:r>
+          </w:p>
+        </w:tc>
+        <w:tc>
+          <w:tcPr>
+            <w:tcW w:type="dxa" w:w="1560"/>
+            <w:shd w:fill="F8FAFC"/>
+            <w:tcMar>
+              <w:top w:w="100" w:type="dxa"/>
+              <w:bottom w:w="100" w:type="dxa"/>
+              <w:left w:w="150" w:type="dxa"/>
+              <w:right w:w="150" w:type="dxa"/>
+            </w:tcMar>
+          </w:tcPr>
+          <w:p>
+            <w:pPr>
+              <w:jc w:val="left"/>
+            </w:pPr>
+            <w:r>
+              <w:rPr>
+                <w:rFonts w:ascii="Times New Roman" w:hAnsi="Times New Roman"/>
+                <w:color w:val="0F172A"/>
+                <w:sz w:val="20"/>
+              </w:rPr>
+              <w:t>Auto-Suggest Engine</w:t>
+            </w:r>
+          </w:p>
+        </w:tc>
+        <w:tc>
+          <w:tcPr>
+            <w:tcW w:type="dxa" w:w="1560"/>
+            <w:shd w:fill="F8FAFC"/>
+            <w:tcMar>
+              <w:top w:w="100" w:type="dxa"/>
+              <w:bottom w:w="100" w:type="dxa"/>
+              <w:left w:w="150" w:type="dxa"/>
+              <w:right w:w="150" w:type="dxa"/>
+            </w:tcMar>
+          </w:tcPr>
+          <w:p>
+            <w:pPr>
+              <w:jc w:val="left"/>
+            </w:pPr>
+            <w:r>
+              <w:rPr>
+                <w:rFonts w:ascii="Times New Roman" w:hAnsi="Times New Roman"/>
+                <w:color w:val="0F172A"/>
+                <w:sz w:val="20"/>
+              </w:rPr>
+              <w:t>Calculate storage size for OLTP DB with 2,500 users &amp; 150,000 transactions</w:t>
+            </w:r>
+          </w:p>
+        </w:tc>
+        <w:tc>
+          <w:tcPr>
+            <w:tcW w:type="dxa" w:w="1560"/>
+            <w:shd w:fill="F8FAFC"/>
+            <w:tcMar>
+              <w:top w:w="100" w:type="dxa"/>
+              <w:bottom w:w="100" w:type="dxa"/>
+              <w:left w:w="150" w:type="dxa"/>
+              <w:right w:w="150" w:type="dxa"/>
+            </w:tcMar>
+          </w:tcPr>
+          <w:p>
+            <w:pPr>
+              <w:jc w:val="left"/>
+            </w:pPr>
+            <w:r>
+              <w:rPr>
+                <w:rFonts w:ascii="Times New Roman" w:hAnsi="Times New Roman"/>
+                <w:color w:val="0F172A"/>
+                <w:sz w:val="20"/>
+              </w:rPr>
+              <w:t>$S_{\text{req}} = 20.0 + (2500 \times 0.05) + (150000 \times 0.0001) = 160.00\text{ GB}$</w:t>
+            </w:r>
+          </w:p>
+        </w:tc>
+        <w:tc>
+          <w:tcPr>
+            <w:tcW w:type="dxa" w:w="1560"/>
+            <w:shd w:fill="F8FAFC"/>
+            <w:tcMar>
+              <w:top w:w="100" w:type="dxa"/>
+              <w:bottom w:w="100" w:type="dxa"/>
+              <w:left w:w="150" w:type="dxa"/>
+              <w:right w:w="150" w:type="dxa"/>
+            </w:tcMar>
+          </w:tcPr>
+          <w:p>
+            <w:pPr>
+              <w:jc w:val="left"/>
+            </w:pPr>
+            <w:r>
+              <w:rPr>
+                <w:rFonts w:ascii="Times New Roman" w:hAnsi="Times New Roman"/>
+                <w:color w:val="0F172A"/>
+                <w:sz w:val="20"/>
+              </w:rPr>
+              <w:t>Auto-calculated 160.00 GB correctly</w:t>
             </w:r>
           </w:p>
         </w:tc>
@@ -5702,47 +6039,6 @@
     </w:p>
     <w:p>
       <w:pPr>
-        <w:keepNext/>
-        <w:spacing w:before="200" w:after="80"/>
-      </w:pPr>
-      <w:r>
-        <w:rPr>
-          <w:rFonts w:ascii="Times New Roman" w:hAnsi="Times New Roman"/>
-          <w:b/>
-          <w:color w:val="475569"/>
-          <w:sz w:val="23"/>
-        </w:rPr>
-        <w:t>Sensitivity Takeaways:</w:t>
-      </w:r>
-    </w:p>
-    <w:p>
-      <w:pPr>
-        <w:spacing w:before="0" w:after="120" w:line="276" w:lineRule="auto"/>
-      </w:pPr>
-      <w:r>
-        <w:rPr>
-          <w:rFonts w:ascii="Times New Roman" w:hAnsi="Times New Roman"/>
-          <w:color w:val="0F172A"/>
-          <w:sz w:val="23"/>
-        </w:rPr>
-        <w:t>- Setting $\alpha = 0.5$ provides the ideal sweet spot for balanced multi-tenant enterprise workloads, yielding significant cost reductions while maintaining high availability (99.924%).</w:t>
-      </w:r>
-    </w:p>
-    <w:p>
-      <w:pPr>
-        <w:spacing w:before="0" w:after="120" w:line="276" w:lineRule="auto"/>
-      </w:pPr>
-      <w:r>
-        <w:rPr>
-          <w:rFonts w:ascii="Times New Roman" w:hAnsi="Times New Roman"/>
-          <w:color w:val="0F172A"/>
-          <w:sz w:val="23"/>
-        </w:rPr>
-        <w:t>- Setting $\alpha = 1.0$ achieves maximum financial savings (mean cost $44.99), making it suitable for cold data archiving workloads where lower availability (99.11%) is acceptable.</w:t>
-      </w:r>
-    </w:p>
-    <w:p>
-      <w:pPr>
         <w:spacing w:before="160" w:after="160"/>
       </w:pPr>
     </w:p>
@@ -6056,7 +6352,7 @@
                 <w:color w:val="0F172A"/>
                 <w:sz w:val="20"/>
               </w:rPr>
-              <w:t>**3. Interactive Web Application**</w:t>
+              <w:t>**3. Automated Workload Storage Estimation**</w:t>
             </w:r>
           </w:p>
         </w:tc>
@@ -6081,7 +6377,7 @@
                 <w:color w:val="0F172A"/>
                 <w:sz w:val="20"/>
               </w:rPr>
-              <w:t>Streamlit single-page application (`app.py`, `modules/`) with real-time baseline evaluation.</w:t>
+              <w:t>Implemented Workload Profile Auto-Suggest Engine in `heuristic.py` &amp; `modules/allocation.py`.</w:t>
             </w:r>
           </w:p>
         </w:tc>
@@ -6133,7 +6429,7 @@
                 <w:color w:val="0F172A"/>
                 <w:sz w:val="20"/>
               </w:rPr>
-              <w:t>**4. Database Persistence &amp; Audit Logging**</w:t>
+              <w:t>**4. Interactive Web Application**</w:t>
             </w:r>
           </w:p>
         </w:tc>
@@ -6158,7 +6454,7 @@
                 <w:color w:val="0F172A"/>
                 <w:sz w:val="20"/>
               </w:rPr>
-              <w:t>SQLite database schema with parameterized transaction logging in `database.py`.</w:t>
+              <w:t>Streamlit single-page application (`app.py`, `modules/`) with real-time baseline evaluation.</w:t>
             </w:r>
           </w:p>
         </w:tc>
@@ -6210,7 +6506,7 @@
                 <w:color w:val="0F172A"/>
                 <w:sz w:val="20"/>
               </w:rPr>
-              <w:t>**5. Empirical Performance Benchmark**</w:t>
+              <w:t>**5. Database Persistence &amp; Audit Logging**</w:t>
             </w:r>
           </w:p>
         </w:tc>
@@ -6235,6 +6531,83 @@
                 <w:color w:val="0F172A"/>
                 <w:sz w:val="20"/>
               </w:rPr>
+              <w:t>SQLite database schema with parameterized transaction logging in `database.py`.</w:t>
+            </w:r>
+          </w:p>
+        </w:tc>
+        <w:tc>
+          <w:tcPr>
+            <w:tcW w:type="dxa" w:w="3120"/>
+            <w:shd w:fill="FFFFFF"/>
+            <w:tcMar>
+              <w:top w:w="100" w:type="dxa"/>
+              <w:bottom w:w="100" w:type="dxa"/>
+              <w:left w:w="150" w:type="dxa"/>
+              <w:right w:w="150" w:type="dxa"/>
+            </w:tcMar>
+          </w:tcPr>
+          <w:p>
+            <w:pPr>
+              <w:jc w:val="left"/>
+            </w:pPr>
+            <w:r>
+              <w:rPr>
+                <w:rFonts w:ascii="Times New Roman" w:hAnsi="Times New Roman"/>
+                <w:color w:val="0F172A"/>
+                <w:sz w:val="20"/>
+              </w:rPr>
+              <w:t>**FULLY ACHIEVED**</w:t>
+            </w:r>
+          </w:p>
+        </w:tc>
+      </w:tr>
+      <w:tr>
+        <w:tc>
+          <w:tcPr>
+            <w:tcW w:type="dxa" w:w="3120"/>
+            <w:shd w:fill="F8FAFC"/>
+            <w:tcMar>
+              <w:top w:w="100" w:type="dxa"/>
+              <w:bottom w:w="100" w:type="dxa"/>
+              <w:left w:w="150" w:type="dxa"/>
+              <w:right w:w="150" w:type="dxa"/>
+            </w:tcMar>
+          </w:tcPr>
+          <w:p>
+            <w:pPr>
+              <w:jc w:val="left"/>
+            </w:pPr>
+            <w:r>
+              <w:rPr>
+                <w:rFonts w:ascii="Times New Roman" w:hAnsi="Times New Roman"/>
+                <w:color w:val="0F172A"/>
+                <w:sz w:val="20"/>
+              </w:rPr>
+              <w:t>**6. Empirical Performance Benchmark**</w:t>
+            </w:r>
+          </w:p>
+        </w:tc>
+        <w:tc>
+          <w:tcPr>
+            <w:tcW w:type="dxa" w:w="3120"/>
+            <w:shd w:fill="F8FAFC"/>
+            <w:tcMar>
+              <w:top w:w="100" w:type="dxa"/>
+              <w:bottom w:w="100" w:type="dxa"/>
+              <w:left w:w="150" w:type="dxa"/>
+              <w:right w:w="150" w:type="dxa"/>
+            </w:tcMar>
+          </w:tcPr>
+          <w:p>
+            <w:pPr>
+              <w:jc w:val="left"/>
+            </w:pPr>
+            <w:r>
+              <w:rPr>
+                <w:rFonts w:ascii="Times New Roman" w:hAnsi="Times New Roman"/>
+                <w:color w:val="0F172A"/>
+                <w:sz w:val="20"/>
+              </w:rPr>
               <w:t>Executed 500-request workload benchmark demonstrating **17.81% cost savings** and **0% SLA violations**.</w:t>
             </w:r>
           </w:p>
@@ -6242,7 +6615,7 @@
         <w:tc>
           <w:tcPr>
             <w:tcW w:type="dxa" w:w="3120"/>
-            <w:shd w:fill="FFFFFF"/>
+            <w:shd w:fill="F8FAFC"/>
             <w:tcMar>
               <w:top w:w="100" w:type="dxa"/>
               <w:bottom w:w="100" w:type="dxa"/>
@@ -6301,7 +6674,7 @@
           <w:color w:val="0F172A"/>
           <w:sz w:val="23"/>
         </w:rPr>
-        <w:t xml:space="preserve">This chapter documented the system implementation, software architecture, user interface design, test execution matrix, and empirical benchmark results for the cloud storage allocation optimization platform. The dual-objective heuristic engine, backed by Streamlit UI components and SQLite persistence, was successfully implemented and empirically validated. The system demonstrated a </w:t>
+        <w:t xml:space="preserve">This chapter documented the system implementation, software architecture, user interface design, test execution matrix, and empirical benchmark results for the cloud storage allocation optimization platform. The dual-objective heuristic engine, supported by the Automatic Storage Size Suggestion Engine, Streamlit UI components, and SQLite persistence, was successfully implemented and empirically validated. The system demonstrated a </w:t>
       </w:r>
       <w:r>
         <w:rPr>

</xml_diff>